<commit_message>
fix contract invoice chronology and requirements
</commit_message>
<xml_diff>
--- a/docs/cinderblock-contract-billing-requirements.docx
+++ b/docs/cinderblock-contract-billing-requirements.docx
@@ -6261,6 +6261,76 @@
     </w:p>
     <w:p>
       <w:pPr>
+        <w:pStyle w:val="Heading3"/>
+        <w:keepNext/>
+      </w:pPr>
+      <w:r>
+        <w:t>STDINV-023 Single active Standard Invoice</w:t>
+      </w:r>
+    </w:p>
+    <w:p>
+      <w:r>
+        <w:t>An Estimate may have at most one active Standard Invoice relationship. A prior Standard Invoice that was deleted or canceled no longer counts as active, but its history remains preserved under existing rules.</w:t>
+      </w:r>
+    </w:p>
+    <w:p>
+      <w:pPr>
+        <w:pStyle w:val="Heading3"/>
+        <w:keepNext/>
+      </w:pPr>
+      <w:r>
+        <w:t>STDINV-024 All entry points</w:t>
+      </w:r>
+    </w:p>
+    <w:p>
+      <w:r>
+        <w:t>The single-active-Standard-Invoice invariant is enforced by the domain across direct creation, linking or relinking an existing Invoice, API and import operations, and future automation. It must not rely only on the Estimate invoice-creation UI.</w:t>
+      </w:r>
+    </w:p>
+    <w:p>
+      <w:pPr>
+        <w:pStyle w:val="Heading3"/>
+        <w:keepNext/>
+      </w:pPr>
+      <w:r>
+        <w:t>STDINV-025 Relationship eligibility</w:t>
+      </w:r>
+    </w:p>
+    <w:p>
+      <w:r>
+        <w:t>Any operation that establishes a Standard Invoice relationship must reject the relationship when the Estimate already has an active Standard Invoice or tracked Progress Invoice history.</w:t>
+      </w:r>
+    </w:p>
+    <w:p>
+      <w:pPr>
+        <w:pStyle w:val="Heading3"/>
+        <w:keepNext/>
+      </w:pPr>
+      <w:r>
+        <w:t>STDINV-026 Existing Invoice linking</w:t>
+      </w:r>
+    </w:p>
+    <w:p>
+      <w:r>
+        <w:t>Linking an existing Invoice to an otherwise eligible Estimate as its Standard Invoice atomically establishes the Linked Estimate relationship, Billed status, conversion lock, and existing Payment Schedule transaction behavior used by direct Standard Invoice creation.</w:t>
+      </w:r>
+    </w:p>
+    <w:p>
+      <w:pPr>
+        <w:pStyle w:val="Heading3"/>
+        <w:keepNext/>
+      </w:pPr>
+      <w:r>
+        <w:t>STDINV-027 Non-source association</w:t>
+      </w:r>
+    </w:p>
+    <w:p>
+      <w:r>
+        <w:t>Sharing a customer or job does not by itself establish a Standard Invoice relationship, mark the Estimate Billed, or lock its billing paths.</w:t>
+      </w:r>
+    </w:p>
+    <w:p>
+      <w:pPr>
         <w:pStyle w:val="Heading2"/>
       </w:pPr>
       <w:r>
@@ -7461,6 +7531,260 @@
                 <w:sz w:val="16"/>
               </w:rPr>
               <w:t>Preview availability</w:t>
+            </w:r>
+          </w:p>
+        </w:tc>
+      </w:tr>
+      <w:tr>
+        <w:tc>
+          <w:tcPr>
+            <w:tcW w:type="dxa" w:w="1872"/>
+            <w:vAlign w:val="center"/>
+            <w:tcMar>
+              <w:top w:w="100" w:type="dxa"/>
+              <w:start w:w="120" w:type="dxa"/>
+              <w:bottom w:w="100" w:type="dxa"/>
+              <w:end w:w="120" w:type="dxa"/>
+            </w:tcMar>
+          </w:tcPr>
+          <w:p>
+            <w:pPr>
+              <w:spacing w:after="0"/>
+            </w:pPr>
+            <w:r>
+              <w:rPr>
+                <w:color w:val="000000"/>
+                <w:sz w:val="16"/>
+              </w:rPr>
+              <w:t>STDINV-023</w:t>
+            </w:r>
+          </w:p>
+        </w:tc>
+        <w:tc>
+          <w:tcPr>
+            <w:tcW w:type="dxa" w:w="8496"/>
+            <w:vAlign w:val="center"/>
+            <w:tcMar>
+              <w:top w:w="100" w:type="dxa"/>
+              <w:start w:w="120" w:type="dxa"/>
+              <w:bottom w:w="100" w:type="dxa"/>
+              <w:end w:w="120" w:type="dxa"/>
+            </w:tcMar>
+          </w:tcPr>
+          <w:p>
+            <w:pPr>
+              <w:spacing w:after="0"/>
+            </w:pPr>
+            <w:r>
+              <w:rPr>
+                <w:color w:val="000000"/>
+                <w:sz w:val="16"/>
+              </w:rPr>
+              <w:t>Single active Standard Invoice</w:t>
+            </w:r>
+          </w:p>
+        </w:tc>
+      </w:tr>
+      <w:tr>
+        <w:tc>
+          <w:tcPr>
+            <w:tcW w:type="dxa" w:w="1872"/>
+            <w:shd w:fill="F5F7FA"/>
+            <w:vAlign w:val="center"/>
+            <w:tcMar>
+              <w:top w:w="100" w:type="dxa"/>
+              <w:start w:w="120" w:type="dxa"/>
+              <w:bottom w:w="100" w:type="dxa"/>
+              <w:end w:w="120" w:type="dxa"/>
+            </w:tcMar>
+          </w:tcPr>
+          <w:p>
+            <w:pPr>
+              <w:spacing w:after="0"/>
+            </w:pPr>
+            <w:r>
+              <w:rPr>
+                <w:color w:val="000000"/>
+                <w:sz w:val="16"/>
+              </w:rPr>
+              <w:t>STDINV-024</w:t>
+            </w:r>
+          </w:p>
+        </w:tc>
+        <w:tc>
+          <w:tcPr>
+            <w:tcW w:type="dxa" w:w="8496"/>
+            <w:shd w:fill="F5F7FA"/>
+            <w:vAlign w:val="center"/>
+            <w:tcMar>
+              <w:top w:w="100" w:type="dxa"/>
+              <w:start w:w="120" w:type="dxa"/>
+              <w:bottom w:w="100" w:type="dxa"/>
+              <w:end w:w="120" w:type="dxa"/>
+            </w:tcMar>
+          </w:tcPr>
+          <w:p>
+            <w:pPr>
+              <w:spacing w:after="0"/>
+            </w:pPr>
+            <w:r>
+              <w:rPr>
+                <w:color w:val="000000"/>
+                <w:sz w:val="16"/>
+              </w:rPr>
+              <w:t>All entry points</w:t>
+            </w:r>
+          </w:p>
+        </w:tc>
+      </w:tr>
+      <w:tr>
+        <w:tc>
+          <w:tcPr>
+            <w:tcW w:type="dxa" w:w="1872"/>
+            <w:vAlign w:val="center"/>
+            <w:tcMar>
+              <w:top w:w="100" w:type="dxa"/>
+              <w:start w:w="120" w:type="dxa"/>
+              <w:bottom w:w="100" w:type="dxa"/>
+              <w:end w:w="120" w:type="dxa"/>
+            </w:tcMar>
+          </w:tcPr>
+          <w:p>
+            <w:pPr>
+              <w:spacing w:after="0"/>
+            </w:pPr>
+            <w:r>
+              <w:rPr>
+                <w:color w:val="000000"/>
+                <w:sz w:val="16"/>
+              </w:rPr>
+              <w:t>STDINV-025</w:t>
+            </w:r>
+          </w:p>
+        </w:tc>
+        <w:tc>
+          <w:tcPr>
+            <w:tcW w:type="dxa" w:w="8496"/>
+            <w:vAlign w:val="center"/>
+            <w:tcMar>
+              <w:top w:w="100" w:type="dxa"/>
+              <w:start w:w="120" w:type="dxa"/>
+              <w:bottom w:w="100" w:type="dxa"/>
+              <w:end w:w="120" w:type="dxa"/>
+            </w:tcMar>
+          </w:tcPr>
+          <w:p>
+            <w:pPr>
+              <w:spacing w:after="0"/>
+            </w:pPr>
+            <w:r>
+              <w:rPr>
+                <w:color w:val="000000"/>
+                <w:sz w:val="16"/>
+              </w:rPr>
+              <w:t>Relationship eligibility</w:t>
+            </w:r>
+          </w:p>
+        </w:tc>
+      </w:tr>
+      <w:tr>
+        <w:tc>
+          <w:tcPr>
+            <w:tcW w:type="dxa" w:w="1872"/>
+            <w:shd w:fill="F5F7FA"/>
+            <w:vAlign w:val="center"/>
+            <w:tcMar>
+              <w:top w:w="100" w:type="dxa"/>
+              <w:start w:w="120" w:type="dxa"/>
+              <w:bottom w:w="100" w:type="dxa"/>
+              <w:end w:w="120" w:type="dxa"/>
+            </w:tcMar>
+          </w:tcPr>
+          <w:p>
+            <w:pPr>
+              <w:spacing w:after="0"/>
+            </w:pPr>
+            <w:r>
+              <w:rPr>
+                <w:color w:val="000000"/>
+                <w:sz w:val="16"/>
+              </w:rPr>
+              <w:t>STDINV-026</w:t>
+            </w:r>
+          </w:p>
+        </w:tc>
+        <w:tc>
+          <w:tcPr>
+            <w:tcW w:type="dxa" w:w="8496"/>
+            <w:shd w:fill="F5F7FA"/>
+            <w:vAlign w:val="center"/>
+            <w:tcMar>
+              <w:top w:w="100" w:type="dxa"/>
+              <w:start w:w="120" w:type="dxa"/>
+              <w:bottom w:w="100" w:type="dxa"/>
+              <w:end w:w="120" w:type="dxa"/>
+            </w:tcMar>
+          </w:tcPr>
+          <w:p>
+            <w:pPr>
+              <w:spacing w:after="0"/>
+            </w:pPr>
+            <w:r>
+              <w:rPr>
+                <w:color w:val="000000"/>
+                <w:sz w:val="16"/>
+              </w:rPr>
+              <w:t>Existing Invoice linking</w:t>
+            </w:r>
+          </w:p>
+        </w:tc>
+      </w:tr>
+      <w:tr>
+        <w:tc>
+          <w:tcPr>
+            <w:tcW w:type="dxa" w:w="1872"/>
+            <w:vAlign w:val="center"/>
+            <w:tcMar>
+              <w:top w:w="100" w:type="dxa"/>
+              <w:start w:w="120" w:type="dxa"/>
+              <w:bottom w:w="100" w:type="dxa"/>
+              <w:end w:w="120" w:type="dxa"/>
+            </w:tcMar>
+          </w:tcPr>
+          <w:p>
+            <w:pPr>
+              <w:spacing w:after="0"/>
+            </w:pPr>
+            <w:r>
+              <w:rPr>
+                <w:color w:val="000000"/>
+                <w:sz w:val="16"/>
+              </w:rPr>
+              <w:t>STDINV-027</w:t>
+            </w:r>
+          </w:p>
+        </w:tc>
+        <w:tc>
+          <w:tcPr>
+            <w:tcW w:type="dxa" w:w="8496"/>
+            <w:vAlign w:val="center"/>
+            <w:tcMar>
+              <w:top w:w="100" w:type="dxa"/>
+              <w:start w:w="120" w:type="dxa"/>
+              <w:bottom w:w="100" w:type="dxa"/>
+              <w:end w:w="120" w:type="dxa"/>
+            </w:tcMar>
+          </w:tcPr>
+          <w:p>
+            <w:pPr>
+              <w:spacing w:after="0"/>
+            </w:pPr>
+            <w:r>
+              <w:rPr>
+                <w:color w:val="000000"/>
+                <w:sz w:val="16"/>
+              </w:rPr>
+              <w:t>Non-source association</w:t>
             </w:r>
           </w:p>
         </w:tc>
@@ -26470,6 +26794,304 @@
           </w:p>
         </w:tc>
       </w:tr>
+      <w:tr>
+        <w:tc>
+          <w:tcPr>
+            <w:tcW w:type="dxa" w:w="1224"/>
+            <w:vAlign w:val="center"/>
+            <w:tcMar>
+              <w:top w:w="100" w:type="dxa"/>
+              <w:start w:w="120" w:type="dxa"/>
+              <w:bottom w:w="100" w:type="dxa"/>
+              <w:end w:w="120" w:type="dxa"/>
+            </w:tcMar>
+          </w:tcPr>
+          <w:p>
+            <w:pPr>
+              <w:spacing w:after="0"/>
+            </w:pPr>
+            <w:r>
+              <w:rPr>
+                <w:color w:val="000000"/>
+                <w:sz w:val="15"/>
+              </w:rPr>
+              <w:t>VALID-021</w:t>
+            </w:r>
+          </w:p>
+        </w:tc>
+        <w:tc>
+          <w:tcPr>
+            <w:tcW w:type="dxa" w:w="2376"/>
+            <w:vAlign w:val="center"/>
+            <w:tcMar>
+              <w:top w:w="100" w:type="dxa"/>
+              <w:start w:w="120" w:type="dxa"/>
+              <w:bottom w:w="100" w:type="dxa"/>
+              <w:end w:w="120" w:type="dxa"/>
+            </w:tcMar>
+          </w:tcPr>
+          <w:p>
+            <w:pPr>
+              <w:spacing w:after="0"/>
+            </w:pPr>
+            <w:r>
+              <w:rPr>
+                <w:color w:val="000000"/>
+                <w:sz w:val="15"/>
+              </w:rPr>
+              <w:t>Second active Standard Invoice</w:t>
+            </w:r>
+          </w:p>
+        </w:tc>
+        <w:tc>
+          <w:tcPr>
+            <w:tcW w:type="dxa" w:w="5472"/>
+            <w:vAlign w:val="center"/>
+            <w:tcMar>
+              <w:top w:w="100" w:type="dxa"/>
+              <w:start w:w="120" w:type="dxa"/>
+              <w:bottom w:w="100" w:type="dxa"/>
+              <w:end w:w="120" w:type="dxa"/>
+            </w:tcMar>
+          </w:tcPr>
+          <w:p>
+            <w:pPr>
+              <w:spacing w:after="0"/>
+            </w:pPr>
+            <w:r>
+              <w:rPr>
+                <w:color w:val="000000"/>
+                <w:sz w:val="15"/>
+              </w:rPr>
+              <w:t>Reject creation or linking of a second active Standard Invoice relationship for the same Estimate.</w:t>
+            </w:r>
+          </w:p>
+        </w:tc>
+        <w:tc>
+          <w:tcPr>
+            <w:tcW w:type="dxa" w:w="1296"/>
+            <w:vAlign w:val="center"/>
+            <w:tcMar>
+              <w:top w:w="100" w:type="dxa"/>
+              <w:start w:w="120" w:type="dxa"/>
+              <w:bottom w:w="100" w:type="dxa"/>
+              <w:end w:w="120" w:type="dxa"/>
+            </w:tcMar>
+          </w:tcPr>
+          <w:p>
+            <w:pPr>
+              <w:spacing w:after="0"/>
+            </w:pPr>
+            <w:r>
+              <w:rPr>
+                <w:color w:val="000000"/>
+                <w:sz w:val="15"/>
+              </w:rPr>
+              <w:t>Hard block</w:t>
+            </w:r>
+          </w:p>
+        </w:tc>
+      </w:tr>
+      <w:tr>
+        <w:tc>
+          <w:tcPr>
+            <w:tcW w:type="dxa" w:w="1224"/>
+            <w:shd w:fill="F5F7FA"/>
+            <w:vAlign w:val="center"/>
+            <w:tcMar>
+              <w:top w:w="100" w:type="dxa"/>
+              <w:start w:w="120" w:type="dxa"/>
+              <w:bottom w:w="100" w:type="dxa"/>
+              <w:end w:w="120" w:type="dxa"/>
+            </w:tcMar>
+          </w:tcPr>
+          <w:p>
+            <w:pPr>
+              <w:spacing w:after="0"/>
+            </w:pPr>
+            <w:r>
+              <w:rPr>
+                <w:color w:val="000000"/>
+                <w:sz w:val="15"/>
+              </w:rPr>
+              <w:t>VALID-022</w:t>
+            </w:r>
+          </w:p>
+        </w:tc>
+        <w:tc>
+          <w:tcPr>
+            <w:tcW w:type="dxa" w:w="2376"/>
+            <w:shd w:fill="F5F7FA"/>
+            <w:vAlign w:val="center"/>
+            <w:tcMar>
+              <w:top w:w="100" w:type="dxa"/>
+              <w:start w:w="120" w:type="dxa"/>
+              <w:bottom w:w="100" w:type="dxa"/>
+              <w:end w:w="120" w:type="dxa"/>
+            </w:tcMar>
+          </w:tcPr>
+          <w:p>
+            <w:pPr>
+              <w:spacing w:after="0"/>
+            </w:pPr>
+            <w:r>
+              <w:rPr>
+                <w:color w:val="000000"/>
+                <w:sz w:val="15"/>
+              </w:rPr>
+              <w:t>Alternate Standard Invoice entry path</w:t>
+            </w:r>
+          </w:p>
+        </w:tc>
+        <w:tc>
+          <w:tcPr>
+            <w:tcW w:type="dxa" w:w="5472"/>
+            <w:shd w:fill="F5F7FA"/>
+            <w:vAlign w:val="center"/>
+            <w:tcMar>
+              <w:top w:w="100" w:type="dxa"/>
+              <w:start w:w="120" w:type="dxa"/>
+              <w:bottom w:w="100" w:type="dxa"/>
+              <w:end w:w="120" w:type="dxa"/>
+            </w:tcMar>
+          </w:tcPr>
+          <w:p>
+            <w:pPr>
+              <w:spacing w:after="0"/>
+            </w:pPr>
+            <w:r>
+              <w:rPr>
+                <w:color w:val="000000"/>
+                <w:sz w:val="15"/>
+              </w:rPr>
+              <w:t>Apply the same Standard Invoice eligibility and lock rules to direct creation, linking, relinking, API, import, and automation paths.</w:t>
+            </w:r>
+          </w:p>
+        </w:tc>
+        <w:tc>
+          <w:tcPr>
+            <w:tcW w:type="dxa" w:w="1296"/>
+            <w:shd w:fill="F5F7FA"/>
+            <w:vAlign w:val="center"/>
+            <w:tcMar>
+              <w:top w:w="100" w:type="dxa"/>
+              <w:start w:w="120" w:type="dxa"/>
+              <w:bottom w:w="100" w:type="dxa"/>
+              <w:end w:w="120" w:type="dxa"/>
+            </w:tcMar>
+          </w:tcPr>
+          <w:p>
+            <w:pPr>
+              <w:spacing w:after="0"/>
+            </w:pPr>
+            <w:r>
+              <w:rPr>
+                <w:color w:val="000000"/>
+                <w:sz w:val="15"/>
+              </w:rPr>
+              <w:t>Hard block</w:t>
+            </w:r>
+          </w:p>
+        </w:tc>
+      </w:tr>
+      <w:tr>
+        <w:tc>
+          <w:tcPr>
+            <w:tcW w:type="dxa" w:w="1224"/>
+            <w:vAlign w:val="center"/>
+            <w:tcMar>
+              <w:top w:w="100" w:type="dxa"/>
+              <w:start w:w="120" w:type="dxa"/>
+              <w:bottom w:w="100" w:type="dxa"/>
+              <w:end w:w="120" w:type="dxa"/>
+            </w:tcMar>
+          </w:tcPr>
+          <w:p>
+            <w:pPr>
+              <w:spacing w:after="0"/>
+            </w:pPr>
+            <w:r>
+              <w:rPr>
+                <w:color w:val="000000"/>
+                <w:sz w:val="15"/>
+              </w:rPr>
+              <w:t>VALID-023</w:t>
+            </w:r>
+          </w:p>
+        </w:tc>
+        <w:tc>
+          <w:tcPr>
+            <w:tcW w:type="dxa" w:w="2376"/>
+            <w:vAlign w:val="center"/>
+            <w:tcMar>
+              <w:top w:w="100" w:type="dxa"/>
+              <w:start w:w="120" w:type="dxa"/>
+              <w:bottom w:w="100" w:type="dxa"/>
+              <w:end w:w="120" w:type="dxa"/>
+            </w:tcMar>
+          </w:tcPr>
+          <w:p>
+            <w:pPr>
+              <w:spacing w:after="0"/>
+            </w:pPr>
+            <w:r>
+              <w:rPr>
+                <w:color w:val="000000"/>
+                <w:sz w:val="15"/>
+              </w:rPr>
+              <w:t>Standard Invoice after tracked billing</w:t>
+            </w:r>
+          </w:p>
+        </w:tc>
+        <w:tc>
+          <w:tcPr>
+            <w:tcW w:type="dxa" w:w="5472"/>
+            <w:vAlign w:val="center"/>
+            <w:tcMar>
+              <w:top w:w="100" w:type="dxa"/>
+              <w:start w:w="120" w:type="dxa"/>
+              <w:bottom w:w="100" w:type="dxa"/>
+              <w:end w:w="120" w:type="dxa"/>
+            </w:tcMar>
+          </w:tcPr>
+          <w:p>
+            <w:pPr>
+              <w:spacing w:after="0"/>
+            </w:pPr>
+            <w:r>
+              <w:rPr>
+                <w:color w:val="000000"/>
+                <w:sz w:val="15"/>
+              </w:rPr>
+              <w:t>Reject creation or linking of a Standard Invoice when the Estimate has tracked Progress Invoice history.</w:t>
+            </w:r>
+          </w:p>
+        </w:tc>
+        <w:tc>
+          <w:tcPr>
+            <w:tcW w:type="dxa" w:w="1296"/>
+            <w:vAlign w:val="center"/>
+            <w:tcMar>
+              <w:top w:w="100" w:type="dxa"/>
+              <w:start w:w="120" w:type="dxa"/>
+              <w:bottom w:w="100" w:type="dxa"/>
+              <w:end w:w="120" w:type="dxa"/>
+            </w:tcMar>
+          </w:tcPr>
+          <w:p>
+            <w:pPr>
+              <w:spacing w:after="0"/>
+            </w:pPr>
+            <w:r>
+              <w:rPr>
+                <w:color w:val="000000"/>
+                <w:sz w:val="15"/>
+              </w:rPr>
+              <w:t>Hard block</w:t>
+            </w:r>
+          </w:p>
+        </w:tc>
+      </w:tr>
     </w:tbl>
     <w:p>
       <w:pPr>
@@ -32427,6 +33049,158 @@
           </w:p>
         </w:tc>
       </w:tr>
+      <w:tr>
+        <w:tc>
+          <w:tcPr>
+            <w:tcW w:type="dxa" w:w="1872"/>
+            <w:vAlign w:val="center"/>
+            <w:tcMar>
+              <w:top w:w="100" w:type="dxa"/>
+              <w:start w:w="120" w:type="dxa"/>
+              <w:bottom w:w="100" w:type="dxa"/>
+              <w:end w:w="120" w:type="dxa"/>
+            </w:tcMar>
+          </w:tcPr>
+          <w:p>
+            <w:pPr>
+              <w:spacing w:after="0"/>
+            </w:pPr>
+            <w:r>
+              <w:rPr>
+                <w:color w:val="000000"/>
+                <w:sz w:val="16"/>
+              </w:rPr>
+              <w:t>VALID-021</w:t>
+            </w:r>
+          </w:p>
+        </w:tc>
+        <w:tc>
+          <w:tcPr>
+            <w:tcW w:type="dxa" w:w="8496"/>
+            <w:vAlign w:val="center"/>
+            <w:tcMar>
+              <w:top w:w="100" w:type="dxa"/>
+              <w:start w:w="120" w:type="dxa"/>
+              <w:bottom w:w="100" w:type="dxa"/>
+              <w:end w:w="120" w:type="dxa"/>
+            </w:tcMar>
+          </w:tcPr>
+          <w:p>
+            <w:pPr>
+              <w:spacing w:after="0"/>
+            </w:pPr>
+            <w:r>
+              <w:rPr>
+                <w:color w:val="000000"/>
+                <w:sz w:val="16"/>
+              </w:rPr>
+              <w:t>Second active Standard Invoice</w:t>
+            </w:r>
+          </w:p>
+        </w:tc>
+      </w:tr>
+      <w:tr>
+        <w:tc>
+          <w:tcPr>
+            <w:tcW w:type="dxa" w:w="1872"/>
+            <w:shd w:fill="F5F7FA"/>
+            <w:vAlign w:val="center"/>
+            <w:tcMar>
+              <w:top w:w="100" w:type="dxa"/>
+              <w:start w:w="120" w:type="dxa"/>
+              <w:bottom w:w="100" w:type="dxa"/>
+              <w:end w:w="120" w:type="dxa"/>
+            </w:tcMar>
+          </w:tcPr>
+          <w:p>
+            <w:pPr>
+              <w:spacing w:after="0"/>
+            </w:pPr>
+            <w:r>
+              <w:rPr>
+                <w:color w:val="000000"/>
+                <w:sz w:val="16"/>
+              </w:rPr>
+              <w:t>VALID-022</w:t>
+            </w:r>
+          </w:p>
+        </w:tc>
+        <w:tc>
+          <w:tcPr>
+            <w:tcW w:type="dxa" w:w="8496"/>
+            <w:shd w:fill="F5F7FA"/>
+            <w:vAlign w:val="center"/>
+            <w:tcMar>
+              <w:top w:w="100" w:type="dxa"/>
+              <w:start w:w="120" w:type="dxa"/>
+              <w:bottom w:w="100" w:type="dxa"/>
+              <w:end w:w="120" w:type="dxa"/>
+            </w:tcMar>
+          </w:tcPr>
+          <w:p>
+            <w:pPr>
+              <w:spacing w:after="0"/>
+            </w:pPr>
+            <w:r>
+              <w:rPr>
+                <w:color w:val="000000"/>
+                <w:sz w:val="16"/>
+              </w:rPr>
+              <w:t>Alternate Standard Invoice entry path</w:t>
+            </w:r>
+          </w:p>
+        </w:tc>
+      </w:tr>
+      <w:tr>
+        <w:tc>
+          <w:tcPr>
+            <w:tcW w:type="dxa" w:w="1872"/>
+            <w:vAlign w:val="center"/>
+            <w:tcMar>
+              <w:top w:w="100" w:type="dxa"/>
+              <w:start w:w="120" w:type="dxa"/>
+              <w:bottom w:w="100" w:type="dxa"/>
+              <w:end w:w="120" w:type="dxa"/>
+            </w:tcMar>
+          </w:tcPr>
+          <w:p>
+            <w:pPr>
+              <w:spacing w:after="0"/>
+            </w:pPr>
+            <w:r>
+              <w:rPr>
+                <w:color w:val="000000"/>
+                <w:sz w:val="16"/>
+              </w:rPr>
+              <w:t>VALID-023</w:t>
+            </w:r>
+          </w:p>
+        </w:tc>
+        <w:tc>
+          <w:tcPr>
+            <w:tcW w:type="dxa" w:w="8496"/>
+            <w:vAlign w:val="center"/>
+            <w:tcMar>
+              <w:top w:w="100" w:type="dxa"/>
+              <w:start w:w="120" w:type="dxa"/>
+              <w:bottom w:w="100" w:type="dxa"/>
+              <w:end w:w="120" w:type="dxa"/>
+            </w:tcMar>
+          </w:tcPr>
+          <w:p>
+            <w:pPr>
+              <w:spacing w:after="0"/>
+            </w:pPr>
+            <w:r>
+              <w:rPr>
+                <w:color w:val="000000"/>
+                <w:sz w:val="16"/>
+              </w:rPr>
+              <w:t>Standard Invoice after tracked billing</w:t>
+            </w:r>
+          </w:p>
+        </w:tc>
+      </w:tr>
     </w:tbl>
     <w:p>
       <w:pPr>
@@ -33071,7 +33845,7 @@
                 <w:color w:val="000000"/>
                 <w:sz w:val="15"/>
               </w:rPr>
-              <w:t>268 atomic requirements reviewed; 0 duplicate IDs found.</w:t>
+              <w:t>276 atomic requirements reviewed; 0 duplicate IDs found.</w:t>
             </w:r>
           </w:p>
         </w:tc>

</xml_diff>